<commit_message>
archive add this data fix (firestore rules)
</commit_message>
<xml_diff>
--- a/backend/templates/FSED-Fire-Safety.docx
+++ b/backend/templates/FSED-Fire-Safety.docx
@@ -232,7 +232,7 @@
           </mc:Choice>
           <mc:Fallback>
             <w:pict>
-              <v:group id="_x0000_s1026" o:spid="_x0000_s1026" o:spt="203" style="height:74.4pt;width:231.7pt;" coordsize="2942655,944880" o:gfxdata="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">
+              <v:group id="_x0000_s1026" o:spid="_x0000_s1026" o:spt="203" style="height:74.4pt;width:231.7pt;" coordsize="2942655,944880" o:gfxdata="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">
                 <o:lock v:ext="edit" aspectratio="f"/>
                 <v:group id="Group 20" o:spid="_x0000_s1026" o:spt="203" style="position:absolute;left:0;top:0;height:943893;width:2942655;" coordorigin="3392,-404" coordsize="5062,1806" o:gfxdata="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">
                   <o:lock v:ext="edit" aspectratio="f"/>
@@ -397,12 +397,14 @@
     </w:p>
     <w:p>
       <w:pPr>
-        <w:spacing w:after="0" w:line="240" w:lineRule="auto"/>
-        <w:jc w:val="center"/>
-        <w:rPr>
-          <w:rFonts w:ascii="Arial" w:hAnsi="Arial" w:cs="Arial"/>
-        </w:rPr>
-      </w:pPr>
+        <w:spacing w:after="0"/>
+        <w:jc w:val="both"/>
+        <w:rPr>
+          <w:rFonts w:ascii="Arial" w:hAnsi="Arial" w:cs="Arial"/>
+        </w:rPr>
+      </w:pPr>
+      <w:bookmarkStart w:id="0" w:name="_GoBack"/>
+      <w:bookmarkEnd w:id="0"/>
       <w:r>
         <w:rPr>
           <w:rFonts w:ascii="Times New Roman" w:hAnsi="Times New Roman" w:cs="Times New Roman"/>
@@ -412,18 +414,18 @@
         <mc:AlternateContent>
           <mc:Choice Requires="wps">
             <w:drawing>
-              <wp:anchor distT="0" distB="0" distL="114300" distR="114300" simplePos="0" relativeHeight="251666432" behindDoc="0" locked="0" layoutInCell="1" allowOverlap="1">
+              <wp:anchor distT="0" distB="0" distL="114300" distR="114300" simplePos="0" relativeHeight="251677696" behindDoc="0" locked="0" layoutInCell="1" allowOverlap="1">
                 <wp:simplePos x="0" y="0"/>
                 <wp:positionH relativeFrom="column">
-                  <wp:posOffset>3939540</wp:posOffset>
+                  <wp:posOffset>3945255</wp:posOffset>
                 </wp:positionH>
                 <wp:positionV relativeFrom="paragraph">
-                  <wp:posOffset>141605</wp:posOffset>
+                  <wp:posOffset>154305</wp:posOffset>
                 </wp:positionV>
                 <wp:extent cx="1828800" cy="276225"/>
                 <wp:effectExtent l="0" t="0" r="0" b="0"/>
                 <wp:wrapNone/>
-                <wp:docPr id="10" name="Text Box 10"/>
+                <wp:docPr id="8" name="Text Box 8"/>
                 <wp:cNvGraphicFramePr/>
                 <a:graphic xmlns:a="http://schemas.openxmlformats.org/drawingml/2006/main">
                   <a:graphicData uri="http://schemas.microsoft.com/office/word/2010/wordprocessingShape">
@@ -464,7 +466,7 @@
                               <w:spacing w:after="0" w:line="240" w:lineRule="auto"/>
                               <w:jc w:val="center"/>
                               <w:rPr>
-                                <w:rFonts w:hint="default" w:ascii="Arial" w:hAnsi="Arial" w:cs="Arial"/>
+                                <w:rFonts w:hint="default" w:ascii="Arial Narrow" w:hAnsi="Arial Narrow" w:cs="Arial Narrow"/>
                                 <w:b/>
                                 <w:bCs/>
                                 <w:sz w:val="24"/>
@@ -474,7 +476,7 @@
                             </w:pPr>
                             <w:r>
                               <w:rPr>
-                                <w:rFonts w:hint="default" w:ascii="Arial" w:hAnsi="Arial" w:cs="Arial"/>
+                                <w:rFonts w:hint="default" w:ascii="Arial Narrow" w:hAnsi="Arial Narrow" w:cs="Arial Narrow"/>
                                 <w:b/>
                                 <w:bCs/>
                                 <w:sz w:val="24"/>
@@ -497,7 +499,7 @@
           </mc:Choice>
           <mc:Fallback>
             <w:pict>
-              <v:shape id="_x0000_s1026" o:spid="_x0000_s1026" o:spt="202" type="#_x0000_t202" style="position:absolute;left:0pt;margin-left:310.2pt;margin-top:11.15pt;height:21.75pt;width:144pt;z-index:251666432;mso-width-relative:page;mso-height-relative:page;" filled="f" stroked="f" coordsize="21600,21600" o:gfxdata="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">
+              <v:shape id="_x0000_s1026" o:spid="_x0000_s1026" o:spt="202" type="#_x0000_t202" style="position:absolute;left:0pt;margin-left:310.65pt;margin-top:12.15pt;height:21.75pt;width:144pt;z-index:251677696;mso-width-relative:page;mso-height-relative:page;" filled="f" stroked="f" coordsize="21600,21600" o:gfxdata="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">
                 <v:fill on="f" focussize="0,0"/>
                 <v:stroke on="f" weight="0.5pt"/>
                 <v:imagedata o:title=""/>
@@ -509,7 +511,7 @@
                         <w:spacing w:after="0" w:line="240" w:lineRule="auto"/>
                         <w:jc w:val="center"/>
                         <w:rPr>
-                          <w:rFonts w:hint="default" w:ascii="Arial" w:hAnsi="Arial" w:cs="Arial"/>
+                          <w:rFonts w:hint="default" w:ascii="Arial Narrow" w:hAnsi="Arial Narrow" w:cs="Arial Narrow"/>
                           <w:b/>
                           <w:bCs/>
                           <w:sz w:val="24"/>
@@ -519,7 +521,7 @@
                       </w:pPr>
                       <w:r>
                         <w:rPr>
-                          <w:rFonts w:hint="default" w:ascii="Arial" w:hAnsi="Arial" w:cs="Arial"/>
+                          <w:rFonts w:hint="default" w:ascii="Arial Narrow" w:hAnsi="Arial Narrow" w:cs="Arial Narrow"/>
                           <w:b/>
                           <w:bCs/>
                           <w:sz w:val="24"/>
@@ -541,241 +543,141 @@
       <w:pPr>
         <w:spacing w:after="0"/>
         <w:rPr>
-          <w:rFonts w:ascii="Arial Narrow" w:hAnsi="Arial Narrow" w:cs="Arial"/>
-        </w:rPr>
-      </w:pPr>
-      <w:r>
-        <w:rPr>
-          <w:rFonts w:ascii="Arial" w:hAnsi="Arial" w:cs="Arial"/>
-          <w:lang w:val="en-US" w:eastAsia="en-US"/>
-        </w:rPr>
-        <mc:AlternateContent>
-          <mc:Choice Requires="wps">
-            <w:drawing>
-              <wp:anchor distT="0" distB="0" distL="114300" distR="114300" simplePos="0" relativeHeight="251668480" behindDoc="0" locked="0" layoutInCell="1" allowOverlap="1">
-                <wp:simplePos x="0" y="0"/>
-                <wp:positionH relativeFrom="column">
-                  <wp:posOffset>1163955</wp:posOffset>
-                </wp:positionH>
-                <wp:positionV relativeFrom="paragraph">
-                  <wp:posOffset>193675</wp:posOffset>
-                </wp:positionV>
-                <wp:extent cx="782955" cy="2540"/>
-                <wp:effectExtent l="0" t="0" r="0" b="0"/>
-                <wp:wrapNone/>
-                <wp:docPr id="2" name="Straight Connector 2"/>
-                <wp:cNvGraphicFramePr/>
-                <a:graphic xmlns:a="http://schemas.openxmlformats.org/drawingml/2006/main">
-                  <a:graphicData uri="http://schemas.microsoft.com/office/word/2010/wordprocessingShape">
-                    <wps:wsp>
-                      <wps:cNvCnPr/>
-                      <wps:spPr>
-                        <a:xfrm flipV="1">
-                          <a:off x="0" y="0"/>
-                          <a:ext cx="782955" cy="2540"/>
-                        </a:xfrm>
-                        <a:prstGeom prst="line">
-                          <a:avLst/>
-                        </a:prstGeom>
-                      </wps:spPr>
-                      <wps:style>
-                        <a:lnRef idx="1">
-                          <a:schemeClr val="dk1"/>
-                        </a:lnRef>
-                        <a:fillRef idx="0">
-                          <a:schemeClr val="dk1"/>
-                        </a:fillRef>
-                        <a:effectRef idx="0">
-                          <a:schemeClr val="dk1"/>
-                        </a:effectRef>
-                        <a:fontRef idx="minor">
-                          <a:schemeClr val="tx1"/>
-                        </a:fontRef>
-                      </wps:style>
-                      <wps:bodyPr/>
-                    </wps:wsp>
-                  </a:graphicData>
-                </a:graphic>
-              </wp:anchor>
-            </w:drawing>
-          </mc:Choice>
-          <mc:Fallback>
-            <w:pict>
-              <v:line id="_x0000_s1026" o:spid="_x0000_s1026" o:spt="20" style="position:absolute;left:0pt;flip:y;margin-left:91.65pt;margin-top:15.25pt;height:0.2pt;width:61.65pt;z-index:251668480;mso-width-relative:page;mso-height-relative:page;" filled="f" stroked="t" coordsize="21600,21600" o:gfxdata="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">
-                <v:fill on="f" focussize="0,0"/>
-                <v:stroke color="#000000 [3200]" joinstyle="round"/>
-                <v:imagedata o:title=""/>
-                <o:lock v:ext="edit" aspectratio="f"/>
-              </v:line>
-            </w:pict>
-          </mc:Fallback>
-        </mc:AlternateContent>
-      </w:r>
-      <w:r>
-        <w:rPr>
-          <w:rFonts w:ascii="Arial" w:hAnsi="Arial" w:cs="Arial"/>
-          <w:lang w:val="en-US" w:eastAsia="en-US"/>
-        </w:rPr>
-        <mc:AlternateContent>
-          <mc:Choice Requires="wps">
-            <w:drawing>
-              <wp:anchor distT="0" distB="0" distL="114300" distR="114300" simplePos="0" relativeHeight="251667456" behindDoc="0" locked="0" layoutInCell="1" allowOverlap="1">
-                <wp:simplePos x="0" y="0"/>
-                <wp:positionH relativeFrom="column">
-                  <wp:posOffset>3907155</wp:posOffset>
-                </wp:positionH>
-                <wp:positionV relativeFrom="paragraph">
-                  <wp:posOffset>208915</wp:posOffset>
-                </wp:positionV>
-                <wp:extent cx="1836420" cy="3810"/>
-                <wp:effectExtent l="0" t="0" r="0" b="0"/>
-                <wp:wrapNone/>
-                <wp:docPr id="18" name="Straight Connector 18"/>
-                <wp:cNvGraphicFramePr/>
-                <a:graphic xmlns:a="http://schemas.openxmlformats.org/drawingml/2006/main">
-                  <a:graphicData uri="http://schemas.microsoft.com/office/word/2010/wordprocessingShape">
-                    <wps:wsp>
-                      <wps:cNvCnPr/>
-                      <wps:spPr>
-                        <a:xfrm>
-                          <a:off x="0" y="0"/>
-                          <a:ext cx="1836420" cy="3810"/>
-                        </a:xfrm>
-                        <a:prstGeom prst="line">
-                          <a:avLst/>
-                        </a:prstGeom>
-                      </wps:spPr>
-                      <wps:style>
-                        <a:lnRef idx="1">
-                          <a:schemeClr val="dk1"/>
-                        </a:lnRef>
-                        <a:fillRef idx="0">
-                          <a:schemeClr val="dk1"/>
-                        </a:fillRef>
-                        <a:effectRef idx="0">
-                          <a:schemeClr val="dk1"/>
-                        </a:effectRef>
-                        <a:fontRef idx="minor">
-                          <a:schemeClr val="tx1"/>
-                        </a:fontRef>
-                      </wps:style>
-                      <wps:bodyPr/>
-                    </wps:wsp>
-                  </a:graphicData>
-                </a:graphic>
-              </wp:anchor>
-            </w:drawing>
-          </mc:Choice>
-          <mc:Fallback>
-            <w:pict>
-              <v:line id="_x0000_s1026" o:spid="_x0000_s1026" o:spt="20" style="position:absolute;left:0pt;margin-left:307.65pt;margin-top:16.45pt;height:0.3pt;width:144.6pt;z-index:251667456;mso-width-relative:page;mso-height-relative:page;" filled="f" stroked="t" coordsize="21600,21600" o:gfxdata="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">
-                <v:fill on="f" focussize="0,0"/>
-                <v:stroke color="#000000 [3200]" joinstyle="round"/>
-                <v:imagedata o:title=""/>
-                <o:lock v:ext="edit" aspectratio="f"/>
-              </v:line>
-            </w:pict>
-          </mc:Fallback>
-        </mc:AlternateContent>
-      </w:r>
-      <w:r>
-        <w:rPr>
-          <w:rFonts w:ascii="Arial Narrow" w:hAnsi="Arial Narrow" w:cs="Arial"/>
+          <w:rFonts w:hint="default" w:ascii="Arial Narrow" w:hAnsi="Arial Narrow" w:cs="Arial Narrow"/>
           <w:b/>
           <w:sz w:val="28"/>
           <w:szCs w:val="28"/>
-        </w:rPr>
-        <w:t>FSCCLPGC NO.  R</w:t>
-      </w:r>
-      <w:r>
-        <w:rPr>
-          <w:rFonts w:hint="default" w:ascii="Arial Narrow" w:hAnsi="Arial Narrow" w:cs="Arial"/>
+          <w:u w:val="single"/>
+        </w:rPr>
+      </w:pPr>
+      <w:r>
+        <w:rPr>
+          <w:rFonts w:hint="default" w:ascii="Arial Narrow" w:hAnsi="Arial Narrow" w:eastAsia="SimSun" w:cs="Arial Narrow"/>
+          <w:b/>
+          <w:bCs/>
+          <w:sz w:val="28"/>
+          <w:szCs w:val="28"/>
+        </w:rPr>
+        <w:t>FSCCLPGC NO</w:t>
+      </w:r>
+      <w:r>
+        <w:rPr>
+          <w:rFonts w:hint="default" w:ascii="Arial Narrow" w:hAnsi="Arial Narrow" w:cs="Arial Narrow"/>
+          <w:sz w:val="28"/>
+          <w:szCs w:val="28"/>
+        </w:rPr>
+        <w:t xml:space="preserve">. </w:t>
+      </w:r>
+      <w:r>
+        <w:rPr>
+          <w:rFonts w:hint="default" w:ascii="Arial Narrow" w:hAnsi="Arial Narrow" w:cs="Arial Narrow"/>
+          <w:b/>
+          <w:bCs/>
+          <w:sz w:val="28"/>
+          <w:szCs w:val="28"/>
+          <w:u w:val="single"/>
+        </w:rPr>
+        <w:t>R10-COFD</w:t>
+      </w:r>
+      <w:r>
+        <w:rPr>
+          <w:rFonts w:hint="default" w:ascii="Arial Narrow" w:hAnsi="Arial Narrow" w:cs="Arial Narrow"/>
+          <w:b/>
+          <w:sz w:val="28"/>
+          <w:szCs w:val="28"/>
+        </w:rPr>
+        <w:tab/>
+      </w:r>
+      <w:r>
+        <w:rPr>
+          <w:rFonts w:hint="default" w:ascii="Arial Narrow" w:hAnsi="Arial Narrow" w:cs="Arial Narrow"/>
+          <w:b/>
+          <w:sz w:val="28"/>
+          <w:szCs w:val="28"/>
+        </w:rPr>
+        <w:tab/>
+      </w:r>
+      <w:r>
+        <w:rPr>
+          <w:rFonts w:hint="default" w:ascii="Arial Narrow" w:hAnsi="Arial Narrow" w:cs="Arial Narrow"/>
           <w:b/>
           <w:sz w:val="28"/>
           <w:szCs w:val="28"/>
           <w:lang w:val="en-US"/>
         </w:rPr>
-        <w:t>10-COFD</w:t>
-      </w:r>
-      <w:r>
-        <w:rPr>
-          <w:rFonts w:ascii="Arial" w:hAnsi="Arial" w:cs="Arial"/>
-          <w:color w:val="FF0000"/>
+        <w:t xml:space="preserve"> </w:t>
+      </w:r>
+      <w:r>
+        <w:rPr>
+          <w:rFonts w:hint="default" w:ascii="Arial Narrow" w:hAnsi="Arial Narrow" w:cs="Arial Narrow"/>
+          <w:b/>
           <w:sz w:val="28"/>
           <w:szCs w:val="28"/>
-        </w:rPr>
-        <w:tab/>
-      </w:r>
-      <w:r>
-        <w:rPr>
-          <w:rFonts w:ascii="Arial" w:hAnsi="Arial" w:cs="Arial"/>
-          <w:color w:val="FF0000"/>
+          <w:lang w:val="en-US"/>
+        </w:rPr>
+        <w:tab/>
+        <w:t/>
+      </w:r>
+      <w:r>
+        <w:rPr>
+          <w:rFonts w:hint="default" w:ascii="Arial Narrow" w:hAnsi="Arial Narrow" w:cs="Arial Narrow"/>
+          <w:b/>
           <w:sz w:val="28"/>
           <w:szCs w:val="28"/>
-        </w:rPr>
-        <w:tab/>
-      </w:r>
-      <w:r>
-        <w:rPr>
-          <w:rFonts w:ascii="Arial" w:hAnsi="Arial" w:cs="Arial"/>
-          <w:color w:val="FF0000"/>
+          <w:lang w:val="en-US"/>
+        </w:rPr>
+        <w:tab/>
+        <w:t xml:space="preserve">     </w:t>
+      </w:r>
+      <w:r>
+        <w:rPr>
+          <w:rFonts w:hint="default" w:ascii="Arial Narrow" w:hAnsi="Arial Narrow" w:cs="Arial Narrow"/>
+          <w:b/>
           <w:sz w:val="28"/>
           <w:szCs w:val="28"/>
-        </w:rPr>
-        <w:t xml:space="preserve">                      </w:t>
-      </w:r>
-      <w:r>
-        <w:rPr>
-          <w:rFonts w:ascii="Arial" w:hAnsi="Arial" w:cs="Arial"/>
-          <w:color w:val="FF0000"/>
-          <w:sz w:val="32"/>
-          <w:szCs w:val="32"/>
           <w:u w:val="single"/>
         </w:rPr>
-        <w:t xml:space="preserve">                   </w:t>
-      </w:r>
-      <w:r>
-        <w:rPr>
-          <w:rFonts w:ascii="Arial Narrow" w:hAnsi="Arial Narrow" w:cs="Arial"/>
-        </w:rPr>
-        <w:t xml:space="preserve">                           </w:t>
+        <w:t>_______________________</w:t>
       </w:r>
     </w:p>
     <w:p>
       <w:pPr>
         <w:spacing w:after="0"/>
-        <w:ind w:left="3600" w:hanging="3600"/>
-        <w:jc w:val="center"/>
-        <w:rPr>
-          <w:rFonts w:ascii="Arial Narrow" w:hAnsi="Arial Narrow" w:cs="Arial"/>
-        </w:rPr>
-      </w:pPr>
-      <w:r>
-        <w:rPr>
-          <w:rFonts w:ascii="Arial Narrow" w:hAnsi="Arial Narrow" w:cs="Arial"/>
-          <w:b/>
-        </w:rPr>
-        <w:tab/>
-      </w:r>
-      <w:r>
-        <w:rPr>
-          <w:rFonts w:ascii="Arial Narrow" w:hAnsi="Arial Narrow" w:cs="Arial"/>
-          <w:b/>
-        </w:rPr>
-        <w:tab/>
-      </w:r>
-      <w:r>
-        <w:rPr>
-          <w:rFonts w:ascii="Arial Narrow" w:hAnsi="Arial Narrow" w:cs="Arial"/>
-          <w:b/>
-        </w:rPr>
-        <w:t xml:space="preserve">                            </w:t>
-      </w:r>
-      <w:r>
-        <w:rPr>
-          <w:rFonts w:ascii="Arial Narrow" w:hAnsi="Arial Narrow" w:cs="Arial"/>
-        </w:rPr>
-        <w:t>DATE</w:t>
+        <w:ind w:left="6480" w:leftChars="0" w:firstLine="720" w:firstLineChars="0"/>
+        <w:rPr>
+          <w:rFonts w:ascii="Arial Narrow" w:hAnsi="Arial Narrow" w:cs="Arial"/>
+        </w:rPr>
+      </w:pPr>
+      <w:r>
+        <w:rPr>
+          <w:rFonts w:hint="default" w:ascii="Arial Narrow" w:hAnsi="Arial Narrow" w:cs="Arial Narrow"/>
+          <w:sz w:val="28"/>
+          <w:szCs w:val="28"/>
+        </w:rPr>
+        <w:t>Date</w:t>
+      </w:r>
+      <w:r>
+        <w:rPr>
+          <w:rFonts w:ascii="Arial Narrow" w:hAnsi="Arial Narrow" w:cs="Arial"/>
+          <w:b/>
+          <w:sz w:val="28"/>
+          <w:szCs w:val="28"/>
+        </w:rPr>
+        <w:tab/>
+      </w:r>
+      <w:r>
+        <w:rPr>
+          <w:rFonts w:ascii="Arial Narrow" w:hAnsi="Arial Narrow" w:cs="Arial"/>
+          <w:b/>
+        </w:rPr>
+        <w:tab/>
+      </w:r>
+      <w:r>
+        <w:rPr>
+          <w:rFonts w:ascii="Arial Narrow" w:hAnsi="Arial Narrow" w:cs="Arial"/>
+          <w:b/>
+        </w:rPr>
+        <w:t xml:space="preserve">                          </w:t>
       </w:r>
     </w:p>
     <w:p>
@@ -1113,7 +1015,7 @@
         <mc:AlternateContent>
           <mc:Choice Requires="wps">
             <w:drawing>
-              <wp:anchor distT="0" distB="0" distL="114300" distR="114300" simplePos="0" relativeHeight="251669504" behindDoc="0" locked="0" layoutInCell="1" allowOverlap="1">
+              <wp:anchor distT="0" distB="0" distL="114300" distR="114300" simplePos="0" relativeHeight="251666432" behindDoc="0" locked="0" layoutInCell="1" allowOverlap="1">
                 <wp:simplePos x="0" y="0"/>
                 <wp:positionH relativeFrom="column">
                   <wp:posOffset>252095</wp:posOffset>
@@ -1200,7 +1102,7 @@
           </mc:Choice>
           <mc:Fallback>
             <w:pict>
-              <v:shape id="_x0000_s1026" o:spid="_x0000_s1026" o:spt="202" type="#_x0000_t202" style="position:absolute;left:0pt;margin-left:19.85pt;margin-top:35.05pt;height:27pt;width:481.45pt;z-index:251669504;mso-width-relative:page;mso-height-relative:page;" filled="f" stroked="f" coordsize="21600,21600" o:gfxdata="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">
+              <v:shape id="_x0000_s1026" o:spid="_x0000_s1026" o:spt="202" type="#_x0000_t202" style="position:absolute;left:0pt;margin-left:19.85pt;margin-top:35.05pt;height:27pt;width:481.45pt;z-index:251666432;mso-width-relative:page;mso-height-relative:page;" filled="f" stroked="f" coordsize="21600,21600" o:gfxdata="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">
                 <v:fill on="f" focussize="0,0"/>
                 <v:stroke on="f" weight="0.5pt"/>
                 <v:imagedata o:title=""/>
@@ -1314,7 +1216,7 @@
         <mc:AlternateContent>
           <mc:Choice Requires="wps">
             <w:drawing>
-              <wp:anchor distT="0" distB="0" distL="114300" distR="114300" simplePos="0" relativeHeight="251670528" behindDoc="0" locked="0" layoutInCell="1" allowOverlap="1">
+              <wp:anchor distT="0" distB="0" distL="114300" distR="114300" simplePos="0" relativeHeight="251667456" behindDoc="0" locked="0" layoutInCell="1" allowOverlap="1">
                 <wp:simplePos x="0" y="0"/>
                 <wp:positionH relativeFrom="column">
                   <wp:posOffset>308610</wp:posOffset>
@@ -1401,7 +1303,7 @@
           </mc:Choice>
           <mc:Fallback>
             <w:pict>
-              <v:shape id="_x0000_s1026" o:spid="_x0000_s1026" o:spt="202" type="#_x0000_t202" style="position:absolute;left:0pt;margin-left:24.3pt;margin-top:6.95pt;height:27pt;width:481.45pt;z-index:251670528;mso-width-relative:page;mso-height-relative:page;" filled="f" stroked="f" coordsize="21600,21600" o:gfxdata="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">
+              <v:shape id="_x0000_s1026" o:spid="_x0000_s1026" o:spt="202" type="#_x0000_t202" style="position:absolute;left:0pt;margin-left:24.3pt;margin-top:6.95pt;height:27pt;width:481.45pt;z-index:251667456;mso-width-relative:page;mso-height-relative:page;" filled="f" stroked="f" coordsize="21600,21600" o:gfxdata="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">
                 <v:fill on="f" focussize="0,0"/>
                 <v:stroke on="f" weight="0.5pt"/>
                 <v:imagedata o:title=""/>
@@ -1506,7 +1408,7 @@
         <mc:AlternateContent>
           <mc:Choice Requires="wps">
             <w:drawing>
-              <wp:anchor distT="0" distB="0" distL="114300" distR="114300" simplePos="0" relativeHeight="251671552" behindDoc="0" locked="0" layoutInCell="1" allowOverlap="1">
+              <wp:anchor distT="0" distB="0" distL="114300" distR="114300" simplePos="0" relativeHeight="251668480" behindDoc="0" locked="0" layoutInCell="1" allowOverlap="1">
                 <wp:simplePos x="0" y="0"/>
                 <wp:positionH relativeFrom="column">
                   <wp:posOffset>217170</wp:posOffset>
@@ -1593,7 +1495,7 @@
           </mc:Choice>
           <mc:Fallback>
             <w:pict>
-              <v:shape id="_x0000_s1026" o:spid="_x0000_s1026" o:spt="202" type="#_x0000_t202" style="position:absolute;left:0pt;margin-left:17.1pt;margin-top:6.1pt;height:27pt;width:481.45pt;z-index:251671552;mso-width-relative:page;mso-height-relative:page;" filled="f" stroked="f" coordsize="21600,21600" o:gfxdata="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">
+              <v:shape id="_x0000_s1026" o:spid="_x0000_s1026" o:spt="202" type="#_x0000_t202" style="position:absolute;left:0pt;margin-left:17.1pt;margin-top:6.1pt;height:27pt;width:481.45pt;z-index:251668480;mso-width-relative:page;mso-height-relative:page;" filled="f" stroked="f" coordsize="21600,21600" o:gfxdata="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">
                 <v:fill on="f" focussize="0,0"/>
                 <v:stroke on="f" weight="0.5pt"/>
                 <v:imagedata o:title=""/>
@@ -1705,7 +1607,7 @@
         <mc:AlternateContent>
           <mc:Choice Requires="wps">
             <w:drawing>
-              <wp:anchor distT="0" distB="0" distL="114300" distR="114300" simplePos="0" relativeHeight="251676672" behindDoc="0" locked="0" layoutInCell="1" allowOverlap="1">
+              <wp:anchor distT="0" distB="0" distL="114300" distR="114300" simplePos="0" relativeHeight="251673600" behindDoc="0" locked="0" layoutInCell="1" allowOverlap="1">
                 <wp:simplePos x="0" y="0"/>
                 <wp:positionH relativeFrom="column">
                   <wp:posOffset>2787015</wp:posOffset>
@@ -1800,7 +1702,7 @@
           </mc:Choice>
           <mc:Fallback>
             <w:pict>
-              <v:shape id="_x0000_s1026" o:spid="_x0000_s1026" o:spt="202" type="#_x0000_t202" style="position:absolute;left:0pt;margin-left:219.45pt;margin-top:7.95pt;height:27pt;width:258.65pt;z-index:251676672;mso-width-relative:page;mso-height-relative:page;" filled="f" stroked="f" coordsize="21600,21600" o:gfxdata="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">
+              <v:shape id="_x0000_s1026" o:spid="_x0000_s1026" o:spt="202" type="#_x0000_t202" style="position:absolute;left:0pt;margin-left:219.45pt;margin-top:7.95pt;height:27pt;width:258.65pt;z-index:251673600;mso-width-relative:page;mso-height-relative:page;" filled="f" stroked="f" coordsize="21600,21600" o:gfxdata="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">
                 <v:fill on="f" focussize="0,0"/>
                 <v:stroke on="f" weight="0.5pt"/>
                 <v:imagedata o:title=""/>
@@ -1859,7 +1761,7 @@
         <mc:AlternateContent>
           <mc:Choice Requires="wps">
             <w:drawing>
-              <wp:anchor distT="0" distB="0" distL="114300" distR="114300" simplePos="0" relativeHeight="251672576" behindDoc="0" locked="0" layoutInCell="1" allowOverlap="1">
+              <wp:anchor distT="0" distB="0" distL="114300" distR="114300" simplePos="0" relativeHeight="251669504" behindDoc="0" locked="0" layoutInCell="1" allowOverlap="1">
                 <wp:simplePos x="0" y="0"/>
                 <wp:positionH relativeFrom="column">
                   <wp:posOffset>136525</wp:posOffset>
@@ -1954,7 +1856,7 @@
           </mc:Choice>
           <mc:Fallback>
             <w:pict>
-              <v:shape id="_x0000_s1026" o:spid="_x0000_s1026" o:spt="202" type="#_x0000_t202" style="position:absolute;left:0pt;margin-left:10.75pt;margin-top:7.6pt;height:27pt;width:258.65pt;z-index:251672576;mso-width-relative:page;mso-height-relative:page;" filled="f" stroked="f" coordsize="21600,21600" o:gfxdata="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">
+              <v:shape id="_x0000_s1026" o:spid="_x0000_s1026" o:spt="202" type="#_x0000_t202" style="position:absolute;left:0pt;margin-left:10.75pt;margin-top:7.6pt;height:27pt;width:258.65pt;z-index:251669504;mso-width-relative:page;mso-height-relative:page;" filled="f" stroked="f" coordsize="21600,21600" o:gfxdata="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">
                 <v:fill on="f" focussize="0,0"/>
                 <v:stroke on="f" weight="0.5pt"/>
                 <v:imagedata o:title=""/>
@@ -2071,7 +1973,7 @@
               <mc:AlternateContent>
                 <mc:Choice Requires="wps">
                   <w:drawing>
-                    <wp:anchor distT="0" distB="0" distL="114300" distR="114300" simplePos="0" relativeHeight="251673600" behindDoc="0" locked="0" layoutInCell="1" allowOverlap="1">
+                    <wp:anchor distT="0" distB="0" distL="114300" distR="114300" simplePos="0" relativeHeight="251670528" behindDoc="0" locked="0" layoutInCell="1" allowOverlap="1">
                       <wp:simplePos x="0" y="0"/>
                       <wp:positionH relativeFrom="column">
                         <wp:posOffset>58420</wp:posOffset>
@@ -2166,7 +2068,7 @@
                 </mc:Choice>
                 <mc:Fallback>
                   <w:pict>
-                    <v:shape id="_x0000_s1026" o:spid="_x0000_s1026" o:spt="202" type="#_x0000_t202" style="position:absolute;left:0pt;margin-left:4.6pt;margin-top:10.3pt;height:27pt;width:258.65pt;z-index:251673600;mso-width-relative:page;mso-height-relative:page;" filled="f" stroked="f" coordsize="21600,21600" o:gfxdata="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">
+                    <v:shape id="_x0000_s1026" o:spid="_x0000_s1026" o:spt="202" type="#_x0000_t202" style="position:absolute;left:0pt;margin-left:4.6pt;margin-top:10.3pt;height:27pt;width:258.65pt;z-index:251670528;mso-width-relative:page;mso-height-relative:page;" filled="f" stroked="f" coordsize="21600,21600" o:gfxdata="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">
                       <v:fill on="f" focussize="0,0"/>
                       <v:stroke on="f" weight="0.5pt"/>
                       <v:imagedata o:title=""/>
@@ -2246,7 +2148,7 @@
               <mc:AlternateContent>
                 <mc:Choice Requires="wps">
                   <w:drawing>
-                    <wp:anchor distT="0" distB="0" distL="114300" distR="114300" simplePos="0" relativeHeight="251677696" behindDoc="0" locked="0" layoutInCell="1" allowOverlap="1">
+                    <wp:anchor distT="0" distB="0" distL="114300" distR="114300" simplePos="0" relativeHeight="251674624" behindDoc="0" locked="0" layoutInCell="1" allowOverlap="1">
                       <wp:simplePos x="0" y="0"/>
                       <wp:positionH relativeFrom="column">
                         <wp:posOffset>5080</wp:posOffset>
@@ -2341,7 +2243,7 @@
                 </mc:Choice>
                 <mc:Fallback>
                   <w:pict>
-                    <v:shape id="_x0000_s1026" o:spid="_x0000_s1026" o:spt="202" type="#_x0000_t202" style="position:absolute;left:0pt;margin-left:0.4pt;margin-top:9.55pt;height:27pt;width:258.65pt;z-index:251677696;mso-width-relative:page;mso-height-relative:page;" filled="f" stroked="f" coordsize="21600,21600" o:gfxdata="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">
+                    <v:shape id="_x0000_s1026" o:spid="_x0000_s1026" o:spt="202" type="#_x0000_t202" style="position:absolute;left:0pt;margin-left:0.4pt;margin-top:9.55pt;height:27pt;width:258.65pt;z-index:251674624;mso-width-relative:page;mso-height-relative:page;" filled="f" stroked="f" coordsize="21600,21600" o:gfxdata="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">
                       <v:fill on="f" focussize="0,0"/>
                       <v:stroke on="f" weight="0.5pt"/>
                       <v:imagedata o:title=""/>
@@ -2441,7 +2343,7 @@
               <mc:AlternateContent>
                 <mc:Choice Requires="wps">
                   <w:drawing>
-                    <wp:anchor distT="0" distB="0" distL="114300" distR="114300" simplePos="0" relativeHeight="251674624" behindDoc="0" locked="0" layoutInCell="1" allowOverlap="1">
+                    <wp:anchor distT="0" distB="0" distL="114300" distR="114300" simplePos="0" relativeHeight="251671552" behindDoc="0" locked="0" layoutInCell="1" allowOverlap="1">
                       <wp:simplePos x="0" y="0"/>
                       <wp:positionH relativeFrom="column">
                         <wp:posOffset>441325</wp:posOffset>
@@ -2536,7 +2438,7 @@
                 </mc:Choice>
                 <mc:Fallback>
                   <w:pict>
-                    <v:shape id="_x0000_s1026" o:spid="_x0000_s1026" o:spt="202" type="#_x0000_t202" style="position:absolute;left:0pt;margin-left:34.75pt;margin-top:10.15pt;height:27pt;width:258.65pt;z-index:251674624;mso-width-relative:page;mso-height-relative:page;" filled="f" stroked="f" coordsize="21600,21600" o:gfxdata="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">
+                    <v:shape id="_x0000_s1026" o:spid="_x0000_s1026" o:spt="202" type="#_x0000_t202" style="position:absolute;left:0pt;margin-left:34.75pt;margin-top:10.15pt;height:27pt;width:258.65pt;z-index:251671552;mso-width-relative:page;mso-height-relative:page;" filled="f" stroked="f" coordsize="21600,21600" o:gfxdata="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">
                       <v:fill on="f" focussize="0,0"/>
                       <v:stroke on="f" weight="0.5pt"/>
                       <v:imagedata o:title=""/>
@@ -2616,7 +2518,7 @@
               <mc:AlternateContent>
                 <mc:Choice Requires="wps">
                   <w:drawing>
-                    <wp:anchor distT="0" distB="0" distL="114300" distR="114300" simplePos="0" relativeHeight="251678720" behindDoc="0" locked="0" layoutInCell="1" allowOverlap="1">
+                    <wp:anchor distT="0" distB="0" distL="114300" distR="114300" simplePos="0" relativeHeight="251675648" behindDoc="0" locked="0" layoutInCell="1" allowOverlap="1">
                       <wp:simplePos x="0" y="0"/>
                       <wp:positionH relativeFrom="column">
                         <wp:posOffset>576580</wp:posOffset>
@@ -2711,7 +2613,7 @@
                 </mc:Choice>
                 <mc:Fallback>
                   <w:pict>
-                    <v:shape id="_x0000_s1026" o:spid="_x0000_s1026" o:spt="202" type="#_x0000_t202" style="position:absolute;left:0pt;margin-left:45.4pt;margin-top:9.95pt;height:27pt;width:258.65pt;z-index:251678720;mso-width-relative:page;mso-height-relative:page;" filled="f" stroked="f" coordsize="21600,21600" o:gfxdata="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">
+                    <v:shape id="_x0000_s1026" o:spid="_x0000_s1026" o:spt="202" type="#_x0000_t202" style="position:absolute;left:0pt;margin-left:45.4pt;margin-top:9.95pt;height:27pt;width:258.65pt;z-index:251675648;mso-width-relative:page;mso-height-relative:page;" filled="f" stroked="f" coordsize="21600,21600" o:gfxdata="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">
                       <v:fill on="f" focussize="0,0"/>
                       <v:stroke on="f" weight="0.5pt"/>
                       <v:imagedata o:title=""/>
@@ -2812,7 +2714,7 @@
               <mc:AlternateContent>
                 <mc:Choice Requires="wps">
                   <w:drawing>
-                    <wp:anchor distT="0" distB="0" distL="114300" distR="114300" simplePos="0" relativeHeight="251675648" behindDoc="0" locked="0" layoutInCell="1" allowOverlap="1">
+                    <wp:anchor distT="0" distB="0" distL="114300" distR="114300" simplePos="0" relativeHeight="251672576" behindDoc="0" locked="0" layoutInCell="1" allowOverlap="1">
                       <wp:simplePos x="0" y="0"/>
                       <wp:positionH relativeFrom="column">
                         <wp:posOffset>-385445</wp:posOffset>
@@ -2907,7 +2809,7 @@
                 </mc:Choice>
                 <mc:Fallback>
                   <w:pict>
-                    <v:shape id="_x0000_s1026" o:spid="_x0000_s1026" o:spt="202" type="#_x0000_t202" style="position:absolute;left:0pt;margin-left:-30.35pt;margin-top:9.95pt;height:27pt;width:258.65pt;z-index:251675648;mso-width-relative:page;mso-height-relative:page;" filled="f" stroked="f" coordsize="21600,21600" o:gfxdata="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">
+                    <v:shape id="_x0000_s1026" o:spid="_x0000_s1026" o:spt="202" type="#_x0000_t202" style="position:absolute;left:0pt;margin-left:-30.35pt;margin-top:9.95pt;height:27pt;width:258.65pt;z-index:251672576;mso-width-relative:page;mso-height-relative:page;" filled="f" stroked="f" coordsize="21600,21600" o:gfxdata="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">
                       <v:fill on="f" focussize="0,0"/>
                       <v:stroke on="f" weight="0.5pt"/>
                       <v:imagedata o:title=""/>
@@ -3090,7 +2992,7 @@
         <mc:AlternateContent>
           <mc:Choice Requires="wps">
             <w:drawing>
-              <wp:anchor distT="0" distB="0" distL="114300" distR="114300" simplePos="0" relativeHeight="251679744" behindDoc="0" locked="0" layoutInCell="1" allowOverlap="1">
+              <wp:anchor distT="0" distB="0" distL="114300" distR="114300" simplePos="0" relativeHeight="251676672" behindDoc="0" locked="0" layoutInCell="1" allowOverlap="1">
                 <wp:simplePos x="0" y="0"/>
                 <wp:positionH relativeFrom="column">
                   <wp:posOffset>1125220</wp:posOffset>
@@ -3173,7 +3075,7 @@
           </mc:Choice>
           <mc:Fallback>
             <w:pict>
-              <v:shape id="_x0000_s1026" o:spid="_x0000_s1026" o:spt="202" type="#_x0000_t202" style="position:absolute;left:0pt;margin-left:88.6pt;margin-top:8.55pt;height:27pt;width:197.95pt;z-index:251679744;mso-width-relative:page;mso-height-relative:page;" filled="f" stroked="f" coordsize="21600,21600" o:gfxdata="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">
+              <v:shape id="_x0000_s1026" o:spid="_x0000_s1026" o:spt="202" type="#_x0000_t202" style="position:absolute;left:0pt;margin-left:88.6pt;margin-top:8.55pt;height:27pt;width:197.95pt;z-index:251676672;mso-width-relative:page;mso-height-relative:page;" filled="f" stroked="f" coordsize="21600,21600" o:gfxdata="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">
                 <v:fill on="f" focussize="0,0"/>
                 <v:stroke on="f" weight="0.5pt"/>
                 <v:imagedata o:title=""/>
@@ -3365,17 +3267,7 @@
           <w:u w:val="single"/>
           <w:lang w:val="en-US"/>
         </w:rPr>
-        <w:t>{OR_AM</w:t>
-      </w:r>
-      <w:bookmarkStart w:id="0" w:name="_GoBack"/>
-      <w:bookmarkEnd w:id="0"/>
-      <w:r>
-        <w:rPr>
-          <w:rFonts w:hint="default" w:ascii="Arial" w:hAnsi="Arial" w:cs="Arial"/>
-          <w:u w:val="single"/>
-          <w:lang w:val="en-US"/>
-        </w:rPr>
-        <w:t>OUNT}</w:t>
+        <w:t>{OR_AMOUNT}</w:t>
       </w:r>
       <w:r>
         <w:rPr>
@@ -4810,7 +4702,7 @@
   <w:docDefaults>
     <w:rPrDefault>
       <w:rPr>
-        <w:rFonts w:asciiTheme="minorHAnsi" w:hAnsiTheme="minorHAnsi" w:eastAsiaTheme="minorEastAsia" w:cstheme="minorBidi"/>
+        <w:rFonts w:ascii="Times New Roman" w:hAnsi="Times New Roman" w:eastAsia="SimSun" w:cs="Times New Roman"/>
       </w:rPr>
     </w:rPrDefault>
     <w:pPrDefault/>
@@ -4963,7 +4855,7 @@
     <w:lsdException w:uiPriority="99" w:name="Table Web 1"/>
     <w:lsdException w:uiPriority="99" w:name="Table Web 2"/>
     <w:lsdException w:uiPriority="99" w:name="Table Web 3"/>
-    <w:lsdException w:uiPriority="99" w:name="Balloon Text"/>
+    <w:lsdException w:qFormat="1" w:uiPriority="99" w:name="Balloon Text"/>
     <w:lsdException w:qFormat="1" w:unhideWhenUsed="0" w:uiPriority="59" w:semiHidden="0" w:name="Table Grid"/>
     <w:lsdException w:uiPriority="99" w:name="Table Theme"/>
     <w:lsdException w:qFormat="1" w:unhideWhenUsed="0" w:uiPriority="1" w:semiHidden="0" w:name="No Spacing"/>
@@ -5107,6 +4999,7 @@
     <w:link w:val="6"/>
     <w:semiHidden/>
     <w:unhideWhenUsed/>
+    <w:qFormat/>
     <w:uiPriority w:val="99"/>
     <w:pPr>
       <w:spacing w:after="0" w:line="240" w:lineRule="auto"/>

</xml_diff>

<commit_message>
hotwork template adjustment and add clearance updates
</commit_message>
<xml_diff>
--- a/backend/templates/FSED-Fire-Safety.docx
+++ b/backend/templates/FSED-Fire-Safety.docx
@@ -71,7 +71,7 @@
           </mc:Choice>
           <mc:Fallback>
             <w:pict>
-              <v:rect id="Rectangle 25" o:spid="_x0000_s1026" o:spt="1" style="position:absolute;left:0pt;margin-left:-31.5pt;margin-top:4.25pt;height:876.3pt;width:531.75pt;z-index:251661312;mso-width-relative:page;mso-height-relative:page;" filled="f" stroked="t" coordsize="21600,21600" o:gfxdata="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">
+              <v:rect id="Rectangle 25" o:spid="_x0000_s1026" o:spt="1" style="position:absolute;left:0pt;margin-left:-31.5pt;margin-top:4.25pt;height:876.3pt;width:531.75pt;z-index:251661312;mso-width-relative:page;mso-height-relative:page;" filled="f" stroked="t" coordsize="21600,21600" o:gfxdata="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">
                 <v:fill on="f" focussize="0,0"/>
                 <v:stroke weight="4.5pt" color="#000000" linestyle="thickThin" miterlimit="8" joinstyle="miter"/>
                 <v:imagedata o:title=""/>
@@ -240,7 +240,7 @@
           </mc:Choice>
           <mc:Fallback>
             <w:pict>
-              <v:group id="_x0000_s1026" o:spid="_x0000_s1026" o:spt="203" style="height:74.4pt;width:231.7pt;" coordsize="2942655,944880" o:gfxdata="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">
+              <v:group id="_x0000_s1026" o:spid="_x0000_s1026" o:spt="203" style="height:74.4pt;width:231.7pt;" coordsize="2942655,944880" o:gfxdata="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">
                 <o:lock v:ext="edit" aspectratio="f"/>
                 <v:group id="Group 20" o:spid="_x0000_s1026" o:spt="203" style="position:absolute;left:0;top:0;height:943893;width:2942655;" coordorigin="3392,-404" coordsize="5062,1806" o:gfxdata="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">
                   <o:lock v:ext="edit" aspectratio="f"/>
@@ -310,8 +310,6 @@
         </w:rPr>
         <w:t>Republic of the Philippines</w:t>
       </w:r>
-      <w:bookmarkStart w:id="0" w:name="_GoBack"/>
-      <w:bookmarkEnd w:id="0"/>
     </w:p>
     <w:p>
       <w:pPr>
@@ -578,13 +576,143 @@
       <w:pPr>
         <w:spacing w:after="0"/>
         <w:rPr>
-          <w:rFonts w:hint="default" w:ascii="Arial Narrow" w:hAnsi="Arial Narrow" w:cs="Arial Narrow"/>
-          <w:b/>
-          <w:sz w:val="28"/>
-          <w:szCs w:val="28"/>
-          <w:u w:val="single"/>
-        </w:rPr>
-      </w:pPr>
+          <w:rFonts w:ascii="Arial Narrow" w:hAnsi="Arial Narrow" w:cs="Arial"/>
+        </w:rPr>
+      </w:pPr>
+      <w:r>
+        <w:rPr>
+          <w:rFonts w:ascii="Arial" w:hAnsi="Arial" w:cs="Arial"/>
+          <w:lang w:val="en-US" w:eastAsia="en-US"/>
+        </w:rPr>
+        <mc:AlternateContent>
+          <mc:Choice Requires="wps">
+            <w:drawing>
+              <wp:anchor distT="0" distB="0" distL="114300" distR="114300" simplePos="0" relativeHeight="251679744" behindDoc="0" locked="0" layoutInCell="1" allowOverlap="1">
+                <wp:simplePos x="0" y="0"/>
+                <wp:positionH relativeFrom="column">
+                  <wp:posOffset>4030345</wp:posOffset>
+                </wp:positionH>
+                <wp:positionV relativeFrom="paragraph">
+                  <wp:posOffset>214630</wp:posOffset>
+                </wp:positionV>
+                <wp:extent cx="1668780" cy="10160"/>
+                <wp:effectExtent l="0" t="4445" r="7620" b="13970"/>
+                <wp:wrapNone/>
+                <wp:docPr id="2" name="Straight Connector 2"/>
+                <wp:cNvGraphicFramePr/>
+                <a:graphic xmlns:a="http://schemas.openxmlformats.org/drawingml/2006/main">
+                  <a:graphicData uri="http://schemas.microsoft.com/office/word/2010/wordprocessingShape">
+                    <wps:wsp>
+                      <wps:cNvCnPr/>
+                      <wps:spPr>
+                        <a:xfrm>
+                          <a:off x="0" y="0"/>
+                          <a:ext cx="1668780" cy="10160"/>
+                        </a:xfrm>
+                        <a:prstGeom prst="line">
+                          <a:avLst/>
+                        </a:prstGeom>
+                      </wps:spPr>
+                      <wps:style>
+                        <a:lnRef idx="1">
+                          <a:schemeClr val="dk1"/>
+                        </a:lnRef>
+                        <a:fillRef idx="0">
+                          <a:schemeClr val="dk1"/>
+                        </a:fillRef>
+                        <a:effectRef idx="0">
+                          <a:schemeClr val="dk1"/>
+                        </a:effectRef>
+                        <a:fontRef idx="minor">
+                          <a:schemeClr val="tx1"/>
+                        </a:fontRef>
+                      </wps:style>
+                      <wps:bodyPr/>
+                    </wps:wsp>
+                  </a:graphicData>
+                </a:graphic>
+              </wp:anchor>
+            </w:drawing>
+          </mc:Choice>
+          <mc:Fallback>
+            <w:pict>
+              <v:line id="_x0000_s1026" o:spid="_x0000_s1026" o:spt="20" style="position:absolute;left:0pt;margin-left:317.35pt;margin-top:16.9pt;height:0.8pt;width:131.4pt;z-index:251679744;mso-width-relative:page;mso-height-relative:page;" filled="f" stroked="t" coordsize="21600,21600" o:gfxdata="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">
+                <v:fill on="f" focussize="0,0"/>
+                <v:stroke color="#000000 [3200]" joinstyle="round"/>
+                <v:imagedata o:title=""/>
+                <o:lock v:ext="edit" aspectratio="f"/>
+              </v:line>
+            </w:pict>
+          </mc:Fallback>
+        </mc:AlternateContent>
+      </w:r>
+      <w:r>
+        <w:rPr>
+          <w:rFonts w:ascii="Arial" w:hAnsi="Arial" w:cs="Arial"/>
+          <w:lang w:val="en-US" w:eastAsia="en-US"/>
+        </w:rPr>
+        <mc:AlternateContent>
+          <mc:Choice Requires="wps">
+            <w:drawing>
+              <wp:anchor distT="0" distB="0" distL="114300" distR="114300" simplePos="0" relativeHeight="251678720" behindDoc="0" locked="0" layoutInCell="1" allowOverlap="1">
+                <wp:simplePos x="0" y="0"/>
+                <wp:positionH relativeFrom="column">
+                  <wp:posOffset>1136650</wp:posOffset>
+                </wp:positionH>
+                <wp:positionV relativeFrom="paragraph">
+                  <wp:posOffset>184785</wp:posOffset>
+                </wp:positionV>
+                <wp:extent cx="1668780" cy="10160"/>
+                <wp:effectExtent l="0" t="4445" r="7620" b="13970"/>
+                <wp:wrapNone/>
+                <wp:docPr id="49" name="Straight Connector 49"/>
+                <wp:cNvGraphicFramePr/>
+                <a:graphic xmlns:a="http://schemas.openxmlformats.org/drawingml/2006/main">
+                  <a:graphicData uri="http://schemas.microsoft.com/office/word/2010/wordprocessingShape">
+                    <wps:wsp>
+                      <wps:cNvCnPr/>
+                      <wps:spPr>
+                        <a:xfrm>
+                          <a:off x="0" y="0"/>
+                          <a:ext cx="1668780" cy="10160"/>
+                        </a:xfrm>
+                        <a:prstGeom prst="line">
+                          <a:avLst/>
+                        </a:prstGeom>
+                      </wps:spPr>
+                      <wps:style>
+                        <a:lnRef idx="1">
+                          <a:schemeClr val="dk1"/>
+                        </a:lnRef>
+                        <a:fillRef idx="0">
+                          <a:schemeClr val="dk1"/>
+                        </a:fillRef>
+                        <a:effectRef idx="0">
+                          <a:schemeClr val="dk1"/>
+                        </a:effectRef>
+                        <a:fontRef idx="minor">
+                          <a:schemeClr val="tx1"/>
+                        </a:fontRef>
+                      </wps:style>
+                      <wps:bodyPr/>
+                    </wps:wsp>
+                  </a:graphicData>
+                </a:graphic>
+              </wp:anchor>
+            </w:drawing>
+          </mc:Choice>
+          <mc:Fallback>
+            <w:pict>
+              <v:line id="_x0000_s1026" o:spid="_x0000_s1026" o:spt="20" style="position:absolute;left:0pt;margin-left:89.5pt;margin-top:14.55pt;height:0.8pt;width:131.4pt;z-index:251678720;mso-width-relative:page;mso-height-relative:page;" filled="f" stroked="t" coordsize="21600,21600" o:gfxdata="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">
+                <v:fill on="f" focussize="0,0"/>
+                <v:stroke color="#000000 [3200]" joinstyle="round"/>
+                <v:imagedata o:title=""/>
+                <o:lock v:ext="edit" aspectratio="f"/>
+              </v:line>
+            </w:pict>
+          </mc:Fallback>
+        </mc:AlternateContent>
+      </w:r>
       <w:r>
         <w:rPr>
           <w:rFonts w:hint="default" w:ascii="Arial Narrow" w:hAnsi="Arial Narrow" w:eastAsia="SimSun" w:cs="Arial Narrow"/>
@@ -610,7 +738,7 @@
           <w:bCs/>
           <w:sz w:val="28"/>
           <w:szCs w:val="28"/>
-          <w:u w:val="single"/>
+          <w:u w:val="none"/>
         </w:rPr>
         <w:t>R10-COFD</w:t>
       </w:r>
@@ -621,118 +749,113 @@
           <w:bCs/>
           <w:sz w:val="28"/>
           <w:szCs w:val="28"/>
-          <w:u w:val="single"/>
+          <w:u w:val="none"/>
           <w:lang w:val="en-US"/>
         </w:rPr>
         <w:t xml:space="preserve">- </w:t>
       </w:r>
       <w:r>
         <w:rPr>
-          <w:rFonts w:hint="default" w:ascii="Arial Narrow" w:hAnsi="Arial Narrow" w:cs="Arial Narrow"/>
-          <w:b/>
-          <w:sz w:val="28"/>
-          <w:szCs w:val="28"/>
+          <w:rFonts w:ascii="Arial Narrow" w:hAnsi="Arial Narrow" w:cs="Arial"/>
+          <w:b/>
+          <w:u w:val="none"/>
+        </w:rPr>
+        <w:t xml:space="preserve"> </w:t>
+      </w:r>
+      <w:r>
+        <w:rPr>
+          <w:rFonts w:ascii="Arial Narrow" w:hAnsi="Arial Narrow" w:cs="Arial"/>
+          <w:b/>
+        </w:rPr>
+        <w:t xml:space="preserve">               </w:t>
+      </w:r>
+    </w:p>
+    <w:p>
+      <w:pPr>
+        <w:spacing w:after="0"/>
+        <w:ind w:left="3600" w:hanging="3600"/>
+        <w:jc w:val="center"/>
+        <w:rPr>
+          <w:rFonts w:ascii="Arial" w:hAnsi="Arial" w:cs="Arial"/>
+          <w:b/>
+          <w:color w:val="17375E" w:themeColor="text2" w:themeShade="BF"/>
+          <w:sz w:val="32"/>
+          <w:szCs w:val="32"/>
+        </w:rPr>
+      </w:pPr>
+      <w:r>
+        <w:rPr>
+          <w:rFonts w:ascii="Arial Narrow" w:hAnsi="Arial Narrow" w:cs="Arial"/>
+          <w:b/>
+        </w:rPr>
+        <w:t xml:space="preserve">      </w:t>
+      </w:r>
+      <w:r>
+        <w:rPr>
+          <w:rFonts w:ascii="Arial Narrow" w:hAnsi="Arial Narrow" w:cs="Arial"/>
+          <w:b/>
+          <w:sz w:val="24"/>
+          <w:szCs w:val="24"/>
+        </w:rPr>
+        <w:t xml:space="preserve"> </w:t>
+      </w:r>
+      <w:r>
+        <w:rPr>
+          <w:rFonts w:hint="default" w:ascii="Arial Narrow" w:hAnsi="Arial Narrow" w:cs="Arial"/>
+          <w:b/>
+          <w:sz w:val="24"/>
+          <w:szCs w:val="24"/>
+          <w:lang w:val="en-US"/>
         </w:rPr>
         <w:tab/>
       </w:r>
       <w:r>
         <w:rPr>
-          <w:rFonts w:hint="default" w:ascii="Arial Narrow" w:hAnsi="Arial Narrow" w:cs="Arial Narrow"/>
-          <w:b/>
-          <w:sz w:val="28"/>
-          <w:szCs w:val="28"/>
+          <w:rFonts w:hint="default" w:ascii="Arial Narrow" w:hAnsi="Arial Narrow" w:cs="Arial"/>
+          <w:b/>
+          <w:sz w:val="24"/>
+          <w:szCs w:val="24"/>
+          <w:lang w:val="en-US"/>
         </w:rPr>
         <w:tab/>
       </w:r>
       <w:r>
         <w:rPr>
-          <w:rFonts w:hint="default" w:ascii="Arial Narrow" w:hAnsi="Arial Narrow" w:cs="Arial Narrow"/>
-          <w:b/>
-          <w:sz w:val="28"/>
-          <w:szCs w:val="28"/>
+          <w:rFonts w:hint="default" w:ascii="Arial Narrow" w:hAnsi="Arial Narrow" w:cs="Arial"/>
+          <w:b/>
+          <w:sz w:val="24"/>
+          <w:szCs w:val="24"/>
           <w:lang w:val="en-US"/>
         </w:rPr>
-        <w:t xml:space="preserve"> </w:t>
-      </w:r>
-      <w:r>
-        <w:rPr>
-          <w:rFonts w:hint="default" w:ascii="Arial Narrow" w:hAnsi="Arial Narrow" w:cs="Arial Narrow"/>
-          <w:b/>
-          <w:sz w:val="28"/>
-          <w:szCs w:val="28"/>
+        <w:tab/>
+      </w:r>
+      <w:r>
+        <w:rPr>
+          <w:rFonts w:hint="default" w:ascii="Arial Narrow" w:hAnsi="Arial Narrow" w:cs="Arial"/>
+          <w:b/>
+          <w:sz w:val="24"/>
+          <w:szCs w:val="24"/>
           <w:lang w:val="en-US"/>
         </w:rPr>
         <w:tab/>
       </w:r>
       <w:r>
         <w:rPr>
-          <w:rFonts w:hint="default" w:ascii="Arial Narrow" w:hAnsi="Arial Narrow" w:cs="Arial Narrow"/>
-          <w:b/>
-          <w:sz w:val="28"/>
-          <w:szCs w:val="28"/>
+          <w:rFonts w:hint="default" w:ascii="Arial Narrow" w:hAnsi="Arial Narrow" w:cs="Arial"/>
+          <w:b/>
+          <w:sz w:val="24"/>
+          <w:szCs w:val="24"/>
           <w:lang w:val="en-US"/>
         </w:rPr>
-        <w:tab/>
-      </w:r>
-      <w:r>
-        <w:rPr>
-          <w:rFonts w:hint="default" w:ascii="Arial Narrow" w:hAnsi="Arial Narrow" w:cs="Arial Narrow"/>
-          <w:b/>
-          <w:sz w:val="28"/>
-          <w:szCs w:val="28"/>
-          <w:lang w:val="en-US"/>
-        </w:rPr>
-        <w:t xml:space="preserve">     </w:t>
-      </w:r>
-      <w:r>
-        <w:rPr>
-          <w:rFonts w:hint="default" w:ascii="Arial Narrow" w:hAnsi="Arial Narrow" w:cs="Arial Narrow"/>
-          <w:b/>
-          <w:sz w:val="28"/>
-          <w:szCs w:val="28"/>
-          <w:u w:val="single"/>
-        </w:rPr>
-        <w:t>_______________________</w:t>
-      </w:r>
-    </w:p>
-    <w:p>
-      <w:pPr>
-        <w:spacing w:after="0"/>
-        <w:ind w:left="6480" w:leftChars="0" w:firstLine="720" w:firstLineChars="0"/>
-        <w:rPr>
-          <w:rFonts w:ascii="Arial Narrow" w:hAnsi="Arial Narrow" w:cs="Arial"/>
-        </w:rPr>
-      </w:pPr>
-      <w:r>
-        <w:rPr>
-          <w:rFonts w:hint="default" w:ascii="Arial Narrow" w:hAnsi="Arial Narrow" w:cs="Arial Narrow"/>
-          <w:sz w:val="28"/>
-          <w:szCs w:val="28"/>
-        </w:rPr>
-        <w:t>Date</w:t>
-      </w:r>
-      <w:r>
-        <w:rPr>
-          <w:rFonts w:ascii="Arial Narrow" w:hAnsi="Arial Narrow" w:cs="Arial"/>
-          <w:b/>
-          <w:sz w:val="28"/>
-          <w:szCs w:val="28"/>
-        </w:rPr>
-        <w:tab/>
-      </w:r>
-      <w:r>
-        <w:rPr>
-          <w:rFonts w:ascii="Arial Narrow" w:hAnsi="Arial Narrow" w:cs="Arial"/>
-          <w:b/>
-        </w:rPr>
-        <w:tab/>
-      </w:r>
-      <w:r>
-        <w:rPr>
-          <w:rFonts w:ascii="Arial Narrow" w:hAnsi="Arial Narrow" w:cs="Arial"/>
-          <w:b/>
-        </w:rPr>
-        <w:t xml:space="preserve">                          </w:t>
+        <w:t xml:space="preserve">  </w:t>
+      </w:r>
+      <w:r>
+        <w:rPr>
+          <w:rFonts w:ascii="Arial Narrow" w:hAnsi="Arial Narrow" w:cs="Arial"/>
+          <w:sz w:val="24"/>
+          <w:szCs w:val="24"/>
+        </w:rPr>
+        <w:t>DATE</w:t>
       </w:r>
     </w:p>
     <w:p>
@@ -1996,6 +2119,12 @@
             <w:insideH w:val="none" w:color="auto" w:sz="0" w:space="0"/>
             <w:insideV w:val="none" w:color="auto" w:sz="0" w:space="0"/>
           </w:tblBorders>
+          <w:tblCellMar>
+            <w:top w:w="0" w:type="dxa"/>
+            <w:left w:w="108" w:type="dxa"/>
+            <w:bottom w:w="0" w:type="dxa"/>
+            <w:right w:w="108" w:type="dxa"/>
+          </w:tblCellMar>
         </w:tblPrEx>
         <w:trPr>
           <w:trHeight w:val="298" w:hRule="atLeast"/>
@@ -3312,6 +3441,28 @@
       </w:r>
       <w:r>
         <w:rPr>
+          <w:rFonts w:hint="default" w:ascii="Arial" w:hAnsi="Arial" w:eastAsia="Helvetica" w:cs="Arial"/>
+          <w:b/>
+          <w:bCs/>
+          <w:i w:val="0"/>
+          <w:iCs w:val="0"/>
+          <w:caps w:val="0"/>
+          <w:color w:val="000000" w:themeColor="text1"/>
+          <w:spacing w:val="0"/>
+          <w:sz w:val="22"/>
+          <w:szCs w:val="22"/>
+          <w:u w:val="single"/>
+          <w:shd w:val="clear" w:fill="FFFFFF"/>
+          <w14:textFill>
+            <w14:solidFill>
+              <w14:schemeClr w14:val="tx1"/>
+            </w14:solidFill>
+          </w14:textFill>
+        </w:rPr>
+        <w:t>₱</w:t>
+      </w:r>
+      <w:r>
+        <w:rPr>
           <w:rFonts w:hint="default" w:ascii="Arial" w:hAnsi="Arial" w:cs="Arial"/>
           <w:u w:val="single"/>
           <w:lang w:val="en-US"/>
@@ -3435,13 +3586,6 @@
       </w:r>
       <w:r>
         <w:rPr>
-          <w:rFonts w:ascii="Arial" w:hAnsi="Arial" w:cs="Arial"/>
-          <w:u w:val="single"/>
-        </w:rPr>
-        <w:tab/>
-      </w:r>
-      <w:r>
-        <w:rPr>
           <w:rFonts w:hint="default" w:ascii="Arial" w:hAnsi="Arial" w:cs="Arial"/>
           <w:u w:val="single"/>
           <w:lang w:val="en-US"/>
@@ -3484,7 +3628,7 @@
           <w:rFonts w:hint="default" w:ascii="Arial Narrow" w:hAnsi="Arial Narrow" w:cs="Arial"/>
           <w:lang w:val="en-US"/>
         </w:rPr>
-        <w:t xml:space="preserve">                </w:t>
+        <w:t xml:space="preserve">                    </w:t>
       </w:r>
       <w:r>
         <w:rPr>
@@ -3580,7 +3724,7 @@
           <w:szCs w:val="20"/>
           <w:lang w:val="en-US"/>
         </w:rPr>
-        <w:t xml:space="preserve">            {</w:t>
+        <w:t xml:space="preserve">     {</w:t>
       </w:r>
       <w:r>
         <w:rPr>
@@ -3790,7 +3934,7 @@
           <w:szCs w:val="20"/>
           <w:lang w:val="en-US"/>
         </w:rPr>
-        <w:t xml:space="preserve">  {MARSHAL}</w:t>
+        <w:t xml:space="preserve">      {MARSHAL}</w:t>
       </w:r>
     </w:p>
     <w:p>
@@ -3908,6 +4052,8 @@
           <w:szCs w:val="15"/>
         </w:rPr>
       </w:pPr>
+      <w:bookmarkStart w:id="0" w:name="_GoBack"/>
+      <w:bookmarkEnd w:id="0"/>
     </w:p>
     <w:p>
       <w:pPr>
@@ -4248,7 +4394,7 @@
           </mc:Choice>
           <mc:Fallback>
             <w:pict>
-              <v:shape id="Text Box 2" o:spid="_x0000_s1026" o:spt="202" type="#_x0000_t202" style="position:absolute;left:0pt;margin-left:-25.2pt;margin-top:12.75pt;height:60pt;width:520.2pt;z-index:251665408;mso-width-relative:page;mso-height-relative:page;" fillcolor="#FFFFFF" filled="t" stroked="t" coordsize="21600,21600" o:gfxdata="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">
+              <v:shape id="Text Box 2" o:spid="_x0000_s1026" o:spt="202" type="#_x0000_t202" style="position:absolute;left:0pt;margin-left:-25.2pt;margin-top:12.75pt;height:60pt;width:520.2pt;z-index:251665408;mso-width-relative:page;mso-height-relative:page;" fillcolor="#FFFFFF" filled="t" stroked="t" coordsize="21600,21600" o:gfxdata="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">
                 <v:fill on="t" focussize="0,0"/>
                 <v:stroke color="#000000" miterlimit="8" joinstyle="miter"/>
                 <v:imagedata o:title=""/>

</xml_diff>